<commit_message>
ci and reasignations updated
</commit_message>
<xml_diff>
--- a/outputs/procedure-gsv-coding.docx
+++ b/outputs/procedure-gsv-coding.docx
@@ -11,12 +11,13 @@
         </w:numPr>
         <w:bidi w:val="0"/>
         <w:spacing w:before="140" w:after="120"/>
-        <w:jc w:val="start"/>
-        <w:rPr/>
-      </w:pPr>
-      <w:r>
-        <w:rPr/>
-        <w:t>Procedure for GSV coding (follow-up first, then baseline)</w:t>
+        <w:ind w:hanging="0" w:start="0"/>
+        <w:jc w:val="start"/>
+        <w:rPr/>
+      </w:pPr>
+      <w:r>
+        <w:rPr/>
+        <w:t>Procedure for GSV coding</w:t>
       </w:r>
     </w:p>
     <w:p>
@@ -29,19 +30,20 @@
       </w:pPr>
       <w:r>
         <w:rPr/>
-        <w:t>Each sampled street segment is observed in two anchor years: follow-up (~2023) and baseline (~2015). Neighbour years are used only as rescue when the anchor year is NA. The logic is</w:t>
-      </w:r>
-      <w:r>
-        <w:rPr/>
-        <w:t>:</w:t>
-      </w:r>
-      <w:r>
-        <w:rPr/>
-        <w:t xml:space="preserve"> try the anchor year; if it cannot be coded even after peg movement, use rescue years; if no year is usable, record NA</w:t>
-      </w:r>
-      <w:r>
-        <w:rPr/>
-        <w:t>.</w:t>
+        <w:t>All sampled segments are coded by two researchers independently following Steps 1–3. After both have completed their coding, Step 4 is performed jointly to review only contradictory cases, with the sole purpose of ruling out human error (not to force agreement with OSM).</w:t>
+      </w:r>
+    </w:p>
+    <w:p>
+      <w:pPr>
+        <w:pStyle w:val="BodyText"/>
+        <w:bidi w:val="0"/>
+        <w:spacing w:lineRule="auto" w:line="276" w:before="0" w:after="140"/>
+        <w:jc w:val="start"/>
+        <w:rPr/>
+      </w:pPr>
+      <w:r>
+        <w:rPr/>
+        <w:t>Each sampled street segment is observed in two anchor years: follow-up (~2023) and baseline (~2015). Neighbour years are used only as rescue years when the anchor year is NA. The logic is: try the anchor year; if it cannot be coded even after peg movement, use rescue years; if no year is usable, record NA.</w:t>
       </w:r>
     </w:p>
     <w:p>
@@ -82,7 +84,7 @@
         <w:pStyle w:val="BodyText"/>
         <w:numPr>
           <w:ilvl w:val="0"/>
-          <w:numId w:val="2"/>
+          <w:numId w:val="1"/>
         </w:numPr>
         <w:bidi w:val="0"/>
         <w:jc w:val="start"/>
@@ -98,7 +100,7 @@
         <w:pStyle w:val="BodyText"/>
         <w:numPr>
           <w:ilvl w:val="0"/>
-          <w:numId w:val="2"/>
+          <w:numId w:val="1"/>
         </w:numPr>
         <w:bidi w:val="0"/>
         <w:jc w:val="start"/>
@@ -106,11 +108,7 @@
       </w:pPr>
       <w:r>
         <w:rPr/>
-        <w:t>If no 2023 pano exists at that point, move the peg along the same street segment to locate a usable 2023 pano</w:t>
-      </w:r>
-      <w:r>
-        <w:rPr/>
-        <w:t>.</w:t>
+        <w:t>If no 2023 pano exists at that point, move the peg along the same street segment to locate a usable 2023 pano.</w:t>
       </w:r>
     </w:p>
     <w:p>
@@ -118,7 +116,7 @@
         <w:pStyle w:val="BodyText"/>
         <w:numPr>
           <w:ilvl w:val="0"/>
-          <w:numId w:val="2"/>
+          <w:numId w:val="1"/>
         </w:numPr>
         <w:bidi w:val="0"/>
         <w:jc w:val="start"/>
@@ -134,7 +132,7 @@
         <w:pStyle w:val="BodyText"/>
         <w:numPr>
           <w:ilvl w:val="1"/>
-          <w:numId w:val="2"/>
+          <w:numId w:val="1"/>
         </w:numPr>
         <w:bidi w:val="0"/>
         <w:jc w:val="start"/>
@@ -142,15 +140,7 @@
       </w:pPr>
       <w:r>
         <w:rPr/>
-        <w:t xml:space="preserve">1 </w:t>
-      </w:r>
-      <w:r>
-        <w:rPr/>
-        <w:t xml:space="preserve">= </w:t>
-      </w:r>
-      <w:r>
-        <w:rPr/>
-        <w:t>infrastructure visible</w:t>
+        <w:t>1 = infrastructure visible</w:t>
       </w:r>
     </w:p>
     <w:p>
@@ -158,7 +148,7 @@
         <w:pStyle w:val="BodyText"/>
         <w:numPr>
           <w:ilvl w:val="1"/>
-          <w:numId w:val="2"/>
+          <w:numId w:val="1"/>
         </w:numPr>
         <w:bidi w:val="0"/>
         <w:jc w:val="start"/>
@@ -166,15 +156,7 @@
       </w:pPr>
       <w:r>
         <w:rPr/>
-        <w:t xml:space="preserve">0 </w:t>
-      </w:r>
-      <w:r>
-        <w:rPr/>
-        <w:t xml:space="preserve">= </w:t>
-      </w:r>
-      <w:r>
-        <w:rPr/>
-        <w:t>clearly absent</w:t>
+        <w:t>0 = clearly absent</w:t>
       </w:r>
     </w:p>
     <w:p>
@@ -182,7 +164,7 @@
         <w:pStyle w:val="BodyText"/>
         <w:numPr>
           <w:ilvl w:val="1"/>
-          <w:numId w:val="2"/>
+          <w:numId w:val="1"/>
         </w:numPr>
         <w:bidi w:val="0"/>
         <w:jc w:val="start"/>
@@ -190,27 +172,7 @@
       </w:pPr>
       <w:r>
         <w:rPr/>
-        <w:t xml:space="preserve">NA </w:t>
-      </w:r>
-      <w:r>
-        <w:rPr/>
-        <w:t xml:space="preserve">= </w:t>
-      </w:r>
-      <w:r>
-        <w:rPr/>
-        <w:t xml:space="preserve">not observable </w:t>
-      </w:r>
-      <w:r>
-        <w:rPr/>
-        <w:t>(</w:t>
-      </w:r>
-      <w:r>
-        <w:rPr/>
-        <w:t>after reasonable peg movement</w:t>
-      </w:r>
-      <w:r>
-        <w:rPr/>
-        <w:t>)</w:t>
+        <w:t>NA = not observable (after reasonable peg movement)</w:t>
       </w:r>
     </w:p>
     <w:p>
@@ -236,7 +198,7 @@
         <w:pStyle w:val="BodyText"/>
         <w:numPr>
           <w:ilvl w:val="0"/>
-          <w:numId w:val="3"/>
+          <w:numId w:val="2"/>
         </w:numPr>
         <w:bidi w:val="0"/>
         <w:jc w:val="start"/>
@@ -244,23 +206,7 @@
       </w:pPr>
       <w:r>
         <w:rPr/>
-        <w:t>Try 2024; if still NA, try 2022</w:t>
-      </w:r>
-      <w:r>
-        <w:rPr/>
-        <w:t xml:space="preserve">, </w:t>
-      </w:r>
-      <w:r>
-        <w:rPr/>
-        <w:t>applying the same peg</w:t>
-      </w:r>
-      <w:r>
-        <w:rPr/>
-        <w:t>-</w:t>
-      </w:r>
-      <w:r>
-        <w:rPr/>
-        <w:t>movement rule.</w:t>
+        <w:t>Try 2024; if still NA, try 2022, applying the same peg-movement rule.</w:t>
       </w:r>
     </w:p>
     <w:p>
@@ -268,7 +214,7 @@
         <w:pStyle w:val="BodyText"/>
         <w:numPr>
           <w:ilvl w:val="0"/>
-          <w:numId w:val="3"/>
+          <w:numId w:val="2"/>
         </w:numPr>
         <w:bidi w:val="0"/>
         <w:jc w:val="start"/>
@@ -276,15 +222,7 @@
       </w:pPr>
       <w:r>
         <w:rPr/>
-        <w:t xml:space="preserve">If none of 2023–24–22 can be observed from any position </w:t>
-      </w:r>
-      <w:r>
-        <w:rPr/>
-        <w:t>on the segment</w:t>
-      </w:r>
-      <w:r>
-        <w:rPr/>
-        <w:t>, record NA for all follow-up columns.</w:t>
+        <w:t>If none of 2023–24–22 can be observed from any position on the segment, record NA for all follow-up columns.</w:t>
       </w:r>
     </w:p>
     <w:p>
@@ -325,7 +263,7 @@
         <w:pStyle w:val="BodyText"/>
         <w:numPr>
           <w:ilvl w:val="0"/>
-          <w:numId w:val="4"/>
+          <w:numId w:val="3"/>
         </w:numPr>
         <w:bidi w:val="0"/>
         <w:jc w:val="start"/>
@@ -341,7 +279,7 @@
         <w:pStyle w:val="BodyText"/>
         <w:numPr>
           <w:ilvl w:val="0"/>
-          <w:numId w:val="4"/>
+          <w:numId w:val="3"/>
         </w:numPr>
         <w:bidi w:val="0"/>
         <w:jc w:val="start"/>
@@ -349,23 +287,7 @@
       </w:pPr>
       <w:r>
         <w:rPr/>
-        <w:t>If no 20</w:t>
-      </w:r>
-      <w:r>
-        <w:rPr/>
-        <w:t>15</w:t>
-      </w:r>
-      <w:r>
-        <w:rPr/>
-        <w:t xml:space="preserve"> pano exists at that point, move the peg along the same street segment to locate a usable 20</w:t>
-      </w:r>
-      <w:r>
-        <w:rPr/>
-        <w:t>15</w:t>
-      </w:r>
-      <w:r>
-        <w:rPr/>
-        <w:t xml:space="preserve"> pano</w:t>
+        <w:t>If no 2015 pano exists at that point, move the peg along the same street segment to locate a usable 2015 pano</w:t>
       </w:r>
     </w:p>
     <w:p>
@@ -373,7 +295,7 @@
         <w:pStyle w:val="BodyText"/>
         <w:numPr>
           <w:ilvl w:val="0"/>
-          <w:numId w:val="4"/>
+          <w:numId w:val="3"/>
         </w:numPr>
         <w:bidi w:val="0"/>
         <w:jc w:val="start"/>
@@ -381,7 +303,15 @@
       </w:pPr>
       <w:r>
         <w:rPr/>
-        <w:t>Then code: 1, 0, or NA.</w:t>
+        <w:t>Then code: 1, 0, or NA</w:t>
+      </w:r>
+      <w:r>
+        <w:rPr/>
+        <w:t xml:space="preserve"> </w:t>
+      </w:r>
+      <w:r>
+        <w:rPr/>
+        <w:t>(as above).</w:t>
       </w:r>
     </w:p>
     <w:p>
@@ -407,7 +337,7 @@
         <w:pStyle w:val="BodyText"/>
         <w:numPr>
           <w:ilvl w:val="0"/>
-          <w:numId w:val="5"/>
+          <w:numId w:val="4"/>
         </w:numPr>
         <w:bidi w:val="0"/>
         <w:jc w:val="start"/>
@@ -415,23 +345,53 @@
       </w:pPr>
       <w:r>
         <w:rPr/>
-        <w:t>Try 2014; if still NA, try 2016</w:t>
-      </w:r>
-      <w:r>
-        <w:rPr/>
-        <w:t xml:space="preserve">, </w:t>
-      </w:r>
-      <w:r>
-        <w:rPr/>
-        <w:t>applying the same peg</w:t>
-      </w:r>
-      <w:r>
-        <w:rPr/>
-        <w:t>-</w:t>
-      </w:r>
-      <w:r>
-        <w:rPr/>
-        <w:t>movement rule.</w:t>
+        <w:t>Try 2014; if still NA, try 2016, applying the same peg-movement rule.</w:t>
+      </w:r>
+    </w:p>
+    <w:p>
+      <w:pPr>
+        <w:pStyle w:val="BodyText"/>
+        <w:numPr>
+          <w:ilvl w:val="0"/>
+          <w:numId w:val="4"/>
+        </w:numPr>
+        <w:bidi w:val="0"/>
+        <w:jc w:val="start"/>
+        <w:rPr/>
+      </w:pPr>
+      <w:r>
+        <w:rPr/>
+        <w:t>If none of 2015–14–16 can be observed, record NA for all baseline columns.</w:t>
+      </w:r>
+    </w:p>
+    <w:p>
+      <w:pPr>
+        <w:pStyle w:val="BodyText"/>
+        <w:bidi w:val="0"/>
+        <w:spacing w:lineRule="auto" w:line="276" w:before="0" w:after="140"/>
+        <w:jc w:val="start"/>
+        <w:rPr/>
+      </w:pPr>
+      <w:r>
+        <w:rPr>
+          <w:rStyle w:val="Strong"/>
+        </w:rPr>
+        <w:t>3) Notes</w:t>
+      </w:r>
+      <w:r>
+        <w:rPr/>
+        <w:br/>
+        <w:t xml:space="preserve">Use the </w:t>
+      </w:r>
+      <w:r>
+        <w:rPr>
+          <w:rStyle w:val="Emphasis"/>
+        </w:rPr>
+        <w:t>Notes</w:t>
+      </w:r>
+      <w:r>
+        <w:rPr/>
+        <w:t xml:space="preserve"> column only for information not captured by the codes, such as:</w:t>
       </w:r>
     </w:p>
     <w:p>
@@ -441,20 +401,64 @@
           <w:ilvl w:val="0"/>
           <w:numId w:val="5"/>
         </w:numPr>
-        <w:bidi w:val="0"/>
-        <w:jc w:val="start"/>
-        <w:rPr/>
-      </w:pPr>
-      <w:r>
-        <w:rPr/>
-        <w:t>If none of 2015–14–16 can be observed, record NA for all baseline columns.</w:t>
-      </w:r>
-    </w:p>
-    <w:p>
-      <w:pPr>
-        <w:pStyle w:val="BodyText"/>
-        <w:bidi w:val="0"/>
-        <w:spacing w:lineRule="auto" w:line="276" w:before="0" w:after="140"/>
+        <w:tabs>
+          <w:tab w:val="left" w:pos="709" w:leader="none"/>
+        </w:tabs>
+        <w:bidi w:val="0"/>
+        <w:ind w:hanging="283" w:start="709"/>
+        <w:jc w:val="start"/>
+        <w:rPr/>
+      </w:pPr>
+      <w:r>
+        <w:rPr/>
+        <w:t>peg moved within 2023 / within 2015 / in both blocks to find a usable panorama</w:t>
+      </w:r>
+    </w:p>
+    <w:p>
+      <w:pPr>
+        <w:pStyle w:val="BodyText"/>
+        <w:numPr>
+          <w:ilvl w:val="0"/>
+          <w:numId w:val="5"/>
+        </w:numPr>
+        <w:tabs>
+          <w:tab w:val="left" w:pos="709" w:leader="none"/>
+        </w:tabs>
+        <w:bidi w:val="0"/>
+        <w:ind w:hanging="283" w:start="709"/>
+        <w:jc w:val="start"/>
+        <w:rPr/>
+      </w:pPr>
+      <w:r>
+        <w:rPr/>
+        <w:t>panorama exists but cannot be interpreted (blur, obstruction, indoor, tunnel)</w:t>
+      </w:r>
+    </w:p>
+    <w:p>
+      <w:pPr>
+        <w:pStyle w:val="BodyText"/>
+        <w:numPr>
+          <w:ilvl w:val="0"/>
+          <w:numId w:val="5"/>
+        </w:numPr>
+        <w:tabs>
+          <w:tab w:val="left" w:pos="709" w:leader="none"/>
+        </w:tabs>
+        <w:bidi w:val="0"/>
+        <w:ind w:hanging="283" w:start="709"/>
+        <w:jc w:val="start"/>
+        <w:rPr/>
+      </w:pPr>
+      <w:r>
+        <w:rPr/>
+        <w:t>unusual context (road works / resurfacing / construction)</w:t>
+      </w:r>
+    </w:p>
+    <w:p>
+      <w:pPr>
+        <w:pStyle w:val="BodyText"/>
+        <w:bidi w:val="0"/>
+        <w:spacing w:before="0" w:after="140"/>
         <w:jc w:val="start"/>
         <w:rPr/>
       </w:pPr>
@@ -462,117 +466,12 @@
         <w:rPr>
           <w:rStyle w:val="Strong"/>
         </w:rPr>
-        <w:t>3</w:t>
-      </w:r>
-      <w:r>
-        <w:rPr>
-          <w:rStyle w:val="Strong"/>
-        </w:rPr>
-        <w:t>) Notes</w:t>
+        <w:t>4) Final contradiction check (joint resolution)</w:t>
       </w:r>
       <w:r>
         <w:rPr/>
         <w:br/>
-        <w:t xml:space="preserve">Use the </w:t>
-      </w:r>
-      <w:r>
-        <w:rPr>
-          <w:rStyle w:val="Emphasis"/>
-        </w:rPr>
-        <w:t>Notes</w:t>
-      </w:r>
-      <w:r>
-        <w:rPr/>
-        <w:t xml:space="preserve"> column only for information not captured by the codes, such as:</w:t>
-      </w:r>
-    </w:p>
-    <w:p>
-      <w:pPr>
-        <w:pStyle w:val="BodyText"/>
-        <w:numPr>
-          <w:ilvl w:val="0"/>
-          <w:numId w:val="6"/>
-        </w:numPr>
-        <w:tabs>
-          <w:tab w:val="clear" w:pos="709"/>
-          <w:tab w:val="left" w:pos="709" w:leader="none"/>
-        </w:tabs>
-        <w:bidi w:val="0"/>
-        <w:ind w:hanging="283" w:start="709"/>
-        <w:jc w:val="start"/>
-        <w:rPr/>
-      </w:pPr>
-      <w:r>
-        <w:rPr/>
-        <w:t>peg moved within 2023 / within 2015 / in both blocks to find a usable panorama</w:t>
-      </w:r>
-    </w:p>
-    <w:p>
-      <w:pPr>
-        <w:pStyle w:val="BodyText"/>
-        <w:numPr>
-          <w:ilvl w:val="0"/>
-          <w:numId w:val="6"/>
-        </w:numPr>
-        <w:tabs>
-          <w:tab w:val="clear" w:pos="709"/>
-          <w:tab w:val="left" w:pos="709" w:leader="none"/>
-        </w:tabs>
-        <w:bidi w:val="0"/>
-        <w:ind w:hanging="283" w:start="709"/>
-        <w:jc w:val="start"/>
-        <w:rPr/>
-      </w:pPr>
-      <w:r>
-        <w:rPr/>
-        <w:t>panorama exists but cannot be interpreted (blur, obstruction, indoor, tunnel)</w:t>
-      </w:r>
-    </w:p>
-    <w:p>
-      <w:pPr>
-        <w:pStyle w:val="BodyText"/>
-        <w:numPr>
-          <w:ilvl w:val="0"/>
-          <w:numId w:val="6"/>
-        </w:numPr>
-        <w:tabs>
-          <w:tab w:val="clear" w:pos="709"/>
-          <w:tab w:val="left" w:pos="709" w:leader="none"/>
-        </w:tabs>
-        <w:bidi w:val="0"/>
-        <w:ind w:hanging="283" w:start="709"/>
-        <w:jc w:val="start"/>
-        <w:rPr/>
-      </w:pPr>
-      <w:r>
-        <w:rPr/>
-        <w:t>unusual context (road works / resurfacing / construction)</w:t>
-      </w:r>
-    </w:p>
-    <w:p>
-      <w:pPr>
-        <w:pStyle w:val="BodyText"/>
-        <w:bidi w:val="0"/>
-        <w:spacing w:before="0" w:after="140"/>
-        <w:jc w:val="start"/>
-        <w:rPr/>
-      </w:pPr>
-      <w:r>
-        <w:rPr>
-          <w:rStyle w:val="Strong"/>
-        </w:rPr>
-        <w:t xml:space="preserve">4) </w:t>
-      </w:r>
-      <w:r>
-        <w:rPr>
-          <w:rStyle w:val="Strong"/>
-        </w:rPr>
-        <w:t>Final contradiction check</w:t>
-      </w:r>
-      <w:r>
-        <w:rPr/>
-        <w:br/>
-        <w:t>After completing all coding, cases in which the OSM-inferred change direction (ADD or REMOVE) is contradicted by the GSV coding are re-inspected only to rule out potential coding errors such as peg misplacement or selecting the wrong year. The final code always reflects what is visible in GSV and is not modified to force agreement with OSM.</w:t>
+        <w:t>After both researchers have finished Steps 1–3, all cases in which the OSM-inferred change direction (ADD or REMOVE) is contradicted by at least one of the GSV coders are jointly re-inspected to rule out human error (peg misplacement, wrong year opened, misinterpretation). If ambiguity remains after re-inspection, the disagreement is retained. The final retained code always reflects what is visible in GSV and is not modified to force agreement with OSM.</w:t>
       </w:r>
     </w:p>
     <w:sectPr>
@@ -593,120 +492,138 @@
   <w:abstractNum w:abstractNumId="1">
     <w:lvl w:ilvl="0">
       <w:start w:val="1"/>
-      <w:numFmt w:val="none"/>
-      <w:suff w:val="nothing"/>
-      <w:lvlText w:val="%1"/>
-      <w:lvlJc w:val="start"/>
-      <w:pPr>
-        <w:tabs>
-          <w:tab w:val="num" w:pos="0"/>
-        </w:tabs>
-        <w:ind w:start="0" w:hanging="0"/>
-      </w:pPr>
+      <w:numFmt w:val="bullet"/>
+      <w:lvlText w:val=""/>
+      <w:lvlJc w:val="start"/>
+      <w:pPr>
+        <w:tabs>
+          <w:tab w:val="num" w:pos="720"/>
+        </w:tabs>
+        <w:ind w:start="720" w:hanging="360"/>
+      </w:pPr>
+      <w:rPr>
+        <w:rFonts w:ascii="Symbol" w:hAnsi="Symbol" w:cs="Symbol" w:hint="default"/>
+      </w:rPr>
     </w:lvl>
     <w:lvl w:ilvl="1">
       <w:start w:val="1"/>
-      <w:numFmt w:val="none"/>
-      <w:suff w:val="nothing"/>
-      <w:lvlText w:val="%2"/>
-      <w:lvlJc w:val="start"/>
-      <w:pPr>
-        <w:tabs>
-          <w:tab w:val="num" w:pos="0"/>
-        </w:tabs>
-        <w:ind w:start="0" w:hanging="0"/>
-      </w:pPr>
+      <w:numFmt w:val="bullet"/>
+      <w:lvlText w:val="◦"/>
+      <w:lvlJc w:val="start"/>
+      <w:pPr>
+        <w:tabs>
+          <w:tab w:val="num" w:pos="1080"/>
+        </w:tabs>
+        <w:ind w:start="1080" w:hanging="360"/>
+      </w:pPr>
+      <w:rPr>
+        <w:rFonts w:ascii="OpenSymbol" w:hAnsi="OpenSymbol" w:cs="OpenSymbol" w:hint="default"/>
+      </w:rPr>
     </w:lvl>
     <w:lvl w:ilvl="2">
       <w:start w:val="1"/>
-      <w:numFmt w:val="none"/>
-      <w:suff w:val="nothing"/>
-      <w:lvlText w:val="%3"/>
-      <w:lvlJc w:val="start"/>
-      <w:pPr>
-        <w:tabs>
-          <w:tab w:val="num" w:pos="0"/>
-        </w:tabs>
-        <w:ind w:start="0" w:hanging="0"/>
-      </w:pPr>
+      <w:numFmt w:val="bullet"/>
+      <w:lvlText w:val="▪"/>
+      <w:lvlJc w:val="start"/>
+      <w:pPr>
+        <w:tabs>
+          <w:tab w:val="num" w:pos="1440"/>
+        </w:tabs>
+        <w:ind w:start="1440" w:hanging="360"/>
+      </w:pPr>
+      <w:rPr>
+        <w:rFonts w:ascii="OpenSymbol" w:hAnsi="OpenSymbol" w:cs="OpenSymbol" w:hint="default"/>
+      </w:rPr>
     </w:lvl>
     <w:lvl w:ilvl="3">
       <w:start w:val="1"/>
-      <w:numFmt w:val="none"/>
-      <w:suff w:val="nothing"/>
-      <w:lvlText w:val="%4"/>
-      <w:lvlJc w:val="start"/>
-      <w:pPr>
-        <w:tabs>
-          <w:tab w:val="num" w:pos="0"/>
-        </w:tabs>
-        <w:ind w:start="0" w:hanging="0"/>
-      </w:pPr>
+      <w:numFmt w:val="bullet"/>
+      <w:lvlText w:val=""/>
+      <w:lvlJc w:val="start"/>
+      <w:pPr>
+        <w:tabs>
+          <w:tab w:val="num" w:pos="1800"/>
+        </w:tabs>
+        <w:ind w:start="1800" w:hanging="360"/>
+      </w:pPr>
+      <w:rPr>
+        <w:rFonts w:ascii="Symbol" w:hAnsi="Symbol" w:cs="Symbol" w:hint="default"/>
+      </w:rPr>
     </w:lvl>
     <w:lvl w:ilvl="4">
       <w:start w:val="1"/>
-      <w:numFmt w:val="none"/>
-      <w:suff w:val="nothing"/>
-      <w:lvlText w:val="%5"/>
-      <w:lvlJc w:val="start"/>
-      <w:pPr>
-        <w:tabs>
-          <w:tab w:val="num" w:pos="0"/>
-        </w:tabs>
-        <w:ind w:start="0" w:hanging="0"/>
-      </w:pPr>
+      <w:numFmt w:val="bullet"/>
+      <w:lvlText w:val="◦"/>
+      <w:lvlJc w:val="start"/>
+      <w:pPr>
+        <w:tabs>
+          <w:tab w:val="num" w:pos="2160"/>
+        </w:tabs>
+        <w:ind w:start="2160" w:hanging="360"/>
+      </w:pPr>
+      <w:rPr>
+        <w:rFonts w:ascii="OpenSymbol" w:hAnsi="OpenSymbol" w:cs="OpenSymbol" w:hint="default"/>
+      </w:rPr>
     </w:lvl>
     <w:lvl w:ilvl="5">
       <w:start w:val="1"/>
-      <w:numFmt w:val="none"/>
-      <w:suff w:val="nothing"/>
-      <w:lvlText w:val="%6"/>
-      <w:lvlJc w:val="start"/>
-      <w:pPr>
-        <w:tabs>
-          <w:tab w:val="num" w:pos="0"/>
-        </w:tabs>
-        <w:ind w:start="0" w:hanging="0"/>
-      </w:pPr>
+      <w:numFmt w:val="bullet"/>
+      <w:lvlText w:val="▪"/>
+      <w:lvlJc w:val="start"/>
+      <w:pPr>
+        <w:tabs>
+          <w:tab w:val="num" w:pos="2520"/>
+        </w:tabs>
+        <w:ind w:start="2520" w:hanging="360"/>
+      </w:pPr>
+      <w:rPr>
+        <w:rFonts w:ascii="OpenSymbol" w:hAnsi="OpenSymbol" w:cs="OpenSymbol" w:hint="default"/>
+      </w:rPr>
     </w:lvl>
     <w:lvl w:ilvl="6">
       <w:start w:val="1"/>
-      <w:numFmt w:val="none"/>
-      <w:suff w:val="nothing"/>
-      <w:lvlText w:val="%7"/>
-      <w:lvlJc w:val="start"/>
-      <w:pPr>
-        <w:tabs>
-          <w:tab w:val="num" w:pos="0"/>
-        </w:tabs>
-        <w:ind w:start="0" w:hanging="0"/>
-      </w:pPr>
+      <w:numFmt w:val="bullet"/>
+      <w:lvlText w:val=""/>
+      <w:lvlJc w:val="start"/>
+      <w:pPr>
+        <w:tabs>
+          <w:tab w:val="num" w:pos="2880"/>
+        </w:tabs>
+        <w:ind w:start="2880" w:hanging="360"/>
+      </w:pPr>
+      <w:rPr>
+        <w:rFonts w:ascii="Symbol" w:hAnsi="Symbol" w:cs="Symbol" w:hint="default"/>
+      </w:rPr>
     </w:lvl>
     <w:lvl w:ilvl="7">
       <w:start w:val="1"/>
-      <w:numFmt w:val="none"/>
-      <w:suff w:val="nothing"/>
-      <w:lvlText w:val="%8"/>
-      <w:lvlJc w:val="start"/>
-      <w:pPr>
-        <w:tabs>
-          <w:tab w:val="num" w:pos="0"/>
-        </w:tabs>
-        <w:ind w:start="0" w:hanging="0"/>
-      </w:pPr>
+      <w:numFmt w:val="bullet"/>
+      <w:lvlText w:val="◦"/>
+      <w:lvlJc w:val="start"/>
+      <w:pPr>
+        <w:tabs>
+          <w:tab w:val="num" w:pos="3240"/>
+        </w:tabs>
+        <w:ind w:start="3240" w:hanging="360"/>
+      </w:pPr>
+      <w:rPr>
+        <w:rFonts w:ascii="OpenSymbol" w:hAnsi="OpenSymbol" w:cs="OpenSymbol" w:hint="default"/>
+      </w:rPr>
     </w:lvl>
     <w:lvl w:ilvl="8">
       <w:start w:val="1"/>
-      <w:numFmt w:val="none"/>
-      <w:suff w:val="nothing"/>
-      <w:lvlText w:val="%9"/>
-      <w:lvlJc w:val="start"/>
-      <w:pPr>
-        <w:tabs>
-          <w:tab w:val="num" w:pos="0"/>
-        </w:tabs>
-        <w:ind w:start="0" w:hanging="0"/>
-      </w:pPr>
+      <w:numFmt w:val="bullet"/>
+      <w:lvlText w:val="▪"/>
+      <w:lvlJc w:val="start"/>
+      <w:pPr>
+        <w:tabs>
+          <w:tab w:val="num" w:pos="3600"/>
+        </w:tabs>
+        <w:ind w:start="3600" w:hanging="360"/>
+      </w:pPr>
+      <w:rPr>
+        <w:rFonts w:ascii="OpenSymbol" w:hAnsi="OpenSymbol" w:cs="OpenSymbol" w:hint="default"/>
+      </w:rPr>
     </w:lvl>
   </w:abstractNum>
   <w:abstractNum w:abstractNumId="2">
@@ -1128,9 +1045,9 @@
       <w:lvlJc w:val="start"/>
       <w:pPr>
         <w:tabs>
-          <w:tab w:val="num" w:pos="720"/>
-        </w:tabs>
-        <w:ind w:start="720" w:hanging="360"/>
+          <w:tab w:val="num" w:pos="709"/>
+        </w:tabs>
+        <w:ind w:start="709" w:hanging="283"/>
       </w:pPr>
       <w:rPr>
         <w:rFonts w:ascii="Symbol" w:hAnsi="Symbol" w:cs="Symbol" w:hint="default"/>
@@ -1139,31 +1056,31 @@
     <w:lvl w:ilvl="1">
       <w:start w:val="1"/>
       <w:numFmt w:val="bullet"/>
-      <w:lvlText w:val="◦"/>
-      <w:lvlJc w:val="start"/>
-      <w:pPr>
-        <w:tabs>
-          <w:tab w:val="num" w:pos="1080"/>
-        </w:tabs>
-        <w:ind w:start="1080" w:hanging="360"/>
-      </w:pPr>
-      <w:rPr>
-        <w:rFonts w:ascii="OpenSymbol" w:hAnsi="OpenSymbol" w:cs="OpenSymbol" w:hint="default"/>
+      <w:lvlText w:val=""/>
+      <w:lvlJc w:val="start"/>
+      <w:pPr>
+        <w:tabs>
+          <w:tab w:val="num" w:pos="1418"/>
+        </w:tabs>
+        <w:ind w:start="1418" w:hanging="283"/>
+      </w:pPr>
+      <w:rPr>
+        <w:rFonts w:ascii="Symbol" w:hAnsi="Symbol" w:cs="Symbol" w:hint="default"/>
       </w:rPr>
     </w:lvl>
     <w:lvl w:ilvl="2">
       <w:start w:val="1"/>
       <w:numFmt w:val="bullet"/>
-      <w:lvlText w:val="▪"/>
-      <w:lvlJc w:val="start"/>
-      <w:pPr>
-        <w:tabs>
-          <w:tab w:val="num" w:pos="1440"/>
-        </w:tabs>
-        <w:ind w:start="1440" w:hanging="360"/>
-      </w:pPr>
-      <w:rPr>
-        <w:rFonts w:ascii="OpenSymbol" w:hAnsi="OpenSymbol" w:cs="OpenSymbol" w:hint="default"/>
+      <w:lvlText w:val=""/>
+      <w:lvlJc w:val="start"/>
+      <w:pPr>
+        <w:tabs>
+          <w:tab w:val="num" w:pos="2127"/>
+        </w:tabs>
+        <w:ind w:start="2127" w:hanging="283"/>
+      </w:pPr>
+      <w:rPr>
+        <w:rFonts w:ascii="Symbol" w:hAnsi="Symbol" w:cs="Symbol" w:hint="default"/>
       </w:rPr>
     </w:lvl>
     <w:lvl w:ilvl="3">
@@ -1173,9 +1090,9 @@
       <w:lvlJc w:val="start"/>
       <w:pPr>
         <w:tabs>
-          <w:tab w:val="num" w:pos="1800"/>
-        </w:tabs>
-        <w:ind w:start="1800" w:hanging="360"/>
+          <w:tab w:val="num" w:pos="2836"/>
+        </w:tabs>
+        <w:ind w:start="2836" w:hanging="283"/>
       </w:pPr>
       <w:rPr>
         <w:rFonts w:ascii="Symbol" w:hAnsi="Symbol" w:cs="Symbol" w:hint="default"/>
@@ -1184,31 +1101,31 @@
     <w:lvl w:ilvl="4">
       <w:start w:val="1"/>
       <w:numFmt w:val="bullet"/>
-      <w:lvlText w:val="◦"/>
-      <w:lvlJc w:val="start"/>
-      <w:pPr>
-        <w:tabs>
-          <w:tab w:val="num" w:pos="2160"/>
-        </w:tabs>
-        <w:ind w:start="2160" w:hanging="360"/>
-      </w:pPr>
-      <w:rPr>
-        <w:rFonts w:ascii="OpenSymbol" w:hAnsi="OpenSymbol" w:cs="OpenSymbol" w:hint="default"/>
+      <w:lvlText w:val=""/>
+      <w:lvlJc w:val="start"/>
+      <w:pPr>
+        <w:tabs>
+          <w:tab w:val="num" w:pos="3545"/>
+        </w:tabs>
+        <w:ind w:start="3545" w:hanging="283"/>
+      </w:pPr>
+      <w:rPr>
+        <w:rFonts w:ascii="Symbol" w:hAnsi="Symbol" w:cs="Symbol" w:hint="default"/>
       </w:rPr>
     </w:lvl>
     <w:lvl w:ilvl="5">
       <w:start w:val="1"/>
       <w:numFmt w:val="bullet"/>
-      <w:lvlText w:val="▪"/>
-      <w:lvlJc w:val="start"/>
-      <w:pPr>
-        <w:tabs>
-          <w:tab w:val="num" w:pos="2520"/>
-        </w:tabs>
-        <w:ind w:start="2520" w:hanging="360"/>
-      </w:pPr>
-      <w:rPr>
-        <w:rFonts w:ascii="OpenSymbol" w:hAnsi="OpenSymbol" w:cs="OpenSymbol" w:hint="default"/>
+      <w:lvlText w:val=""/>
+      <w:lvlJc w:val="start"/>
+      <w:pPr>
+        <w:tabs>
+          <w:tab w:val="num" w:pos="4254"/>
+        </w:tabs>
+        <w:ind w:start="4254" w:hanging="283"/>
+      </w:pPr>
+      <w:rPr>
+        <w:rFonts w:ascii="Symbol" w:hAnsi="Symbol" w:cs="Symbol" w:hint="default"/>
       </w:rPr>
     </w:lvl>
     <w:lvl w:ilvl="6">
@@ -1218,9 +1135,9 @@
       <w:lvlJc w:val="start"/>
       <w:pPr>
         <w:tabs>
-          <w:tab w:val="num" w:pos="2880"/>
-        </w:tabs>
-        <w:ind w:start="2880" w:hanging="360"/>
+          <w:tab w:val="num" w:pos="4963"/>
+        </w:tabs>
+        <w:ind w:start="4963" w:hanging="283"/>
       </w:pPr>
       <w:rPr>
         <w:rFonts w:ascii="Symbol" w:hAnsi="Symbol" w:cs="Symbol" w:hint="default"/>
@@ -1229,169 +1146,151 @@
     <w:lvl w:ilvl="7">
       <w:start w:val="1"/>
       <w:numFmt w:val="bullet"/>
-      <w:lvlText w:val="◦"/>
-      <w:lvlJc w:val="start"/>
-      <w:pPr>
-        <w:tabs>
-          <w:tab w:val="num" w:pos="3240"/>
-        </w:tabs>
-        <w:ind w:start="3240" w:hanging="360"/>
-      </w:pPr>
-      <w:rPr>
-        <w:rFonts w:ascii="OpenSymbol" w:hAnsi="OpenSymbol" w:cs="OpenSymbol" w:hint="default"/>
+      <w:lvlText w:val=""/>
+      <w:lvlJc w:val="start"/>
+      <w:pPr>
+        <w:tabs>
+          <w:tab w:val="num" w:pos="5672"/>
+        </w:tabs>
+        <w:ind w:start="5672" w:hanging="283"/>
+      </w:pPr>
+      <w:rPr>
+        <w:rFonts w:ascii="Symbol" w:hAnsi="Symbol" w:cs="Symbol" w:hint="default"/>
       </w:rPr>
     </w:lvl>
     <w:lvl w:ilvl="8">
       <w:start w:val="1"/>
       <w:numFmt w:val="bullet"/>
-      <w:lvlText w:val="▪"/>
-      <w:lvlJc w:val="start"/>
-      <w:pPr>
-        <w:tabs>
-          <w:tab w:val="num" w:pos="3600"/>
-        </w:tabs>
-        <w:ind w:start="3600" w:hanging="360"/>
-      </w:pPr>
-      <w:rPr>
-        <w:rFonts w:ascii="OpenSymbol" w:hAnsi="OpenSymbol" w:cs="OpenSymbol" w:hint="default"/>
+      <w:lvlText w:val=""/>
+      <w:lvlJc w:val="start"/>
+      <w:pPr>
+        <w:tabs>
+          <w:tab w:val="num" w:pos="6381"/>
+        </w:tabs>
+        <w:ind w:start="6381" w:hanging="283"/>
+      </w:pPr>
+      <w:rPr>
+        <w:rFonts w:ascii="Symbol" w:hAnsi="Symbol" w:cs="Symbol" w:hint="default"/>
       </w:rPr>
     </w:lvl>
   </w:abstractNum>
   <w:abstractNum w:abstractNumId="6">
     <w:lvl w:ilvl="0">
       <w:start w:val="1"/>
-      <w:numFmt w:val="bullet"/>
-      <w:lvlText w:val=""/>
-      <w:lvlJc w:val="start"/>
-      <w:pPr>
-        <w:tabs>
-          <w:tab w:val="num" w:pos="709"/>
-        </w:tabs>
-        <w:ind w:start="709" w:hanging="283"/>
-      </w:pPr>
-      <w:rPr>
-        <w:rFonts w:ascii="Symbol" w:hAnsi="Symbol" w:cs="Symbol" w:hint="default"/>
-      </w:rPr>
+      <w:numFmt w:val="none"/>
+      <w:suff w:val="nothing"/>
+      <w:lvlText w:val=""/>
+      <w:lvlJc w:val="start"/>
+      <w:pPr>
+        <w:tabs>
+          <w:tab w:val="num" w:pos="0"/>
+        </w:tabs>
+        <w:ind w:start="0" w:hanging="0"/>
+      </w:pPr>
     </w:lvl>
     <w:lvl w:ilvl="1">
       <w:start w:val="1"/>
-      <w:numFmt w:val="bullet"/>
-      <w:lvlText w:val=""/>
-      <w:lvlJc w:val="start"/>
-      <w:pPr>
-        <w:tabs>
-          <w:tab w:val="num" w:pos="1418"/>
-        </w:tabs>
-        <w:ind w:start="1418" w:hanging="283"/>
-      </w:pPr>
-      <w:rPr>
-        <w:rFonts w:ascii="Symbol" w:hAnsi="Symbol" w:cs="Symbol" w:hint="default"/>
-      </w:rPr>
+      <w:numFmt w:val="none"/>
+      <w:suff w:val="nothing"/>
+      <w:lvlText w:val=""/>
+      <w:lvlJc w:val="start"/>
+      <w:pPr>
+        <w:tabs>
+          <w:tab w:val="num" w:pos="0"/>
+        </w:tabs>
+        <w:ind w:start="0" w:hanging="0"/>
+      </w:pPr>
     </w:lvl>
     <w:lvl w:ilvl="2">
       <w:start w:val="1"/>
-      <w:numFmt w:val="bullet"/>
-      <w:lvlText w:val=""/>
-      <w:lvlJc w:val="start"/>
-      <w:pPr>
-        <w:tabs>
-          <w:tab w:val="num" w:pos="2127"/>
-        </w:tabs>
-        <w:ind w:start="2127" w:hanging="283"/>
-      </w:pPr>
-      <w:rPr>
-        <w:rFonts w:ascii="Symbol" w:hAnsi="Symbol" w:cs="Symbol" w:hint="default"/>
-      </w:rPr>
+      <w:numFmt w:val="none"/>
+      <w:suff w:val="nothing"/>
+      <w:lvlText w:val=""/>
+      <w:lvlJc w:val="start"/>
+      <w:pPr>
+        <w:tabs>
+          <w:tab w:val="num" w:pos="0"/>
+        </w:tabs>
+        <w:ind w:start="0" w:hanging="0"/>
+      </w:pPr>
     </w:lvl>
     <w:lvl w:ilvl="3">
       <w:start w:val="1"/>
-      <w:numFmt w:val="bullet"/>
-      <w:lvlText w:val=""/>
-      <w:lvlJc w:val="start"/>
-      <w:pPr>
-        <w:tabs>
-          <w:tab w:val="num" w:pos="2836"/>
-        </w:tabs>
-        <w:ind w:start="2836" w:hanging="283"/>
-      </w:pPr>
-      <w:rPr>
-        <w:rFonts w:ascii="Symbol" w:hAnsi="Symbol" w:cs="Symbol" w:hint="default"/>
-      </w:rPr>
+      <w:numFmt w:val="none"/>
+      <w:suff w:val="nothing"/>
+      <w:lvlText w:val=""/>
+      <w:lvlJc w:val="start"/>
+      <w:pPr>
+        <w:tabs>
+          <w:tab w:val="num" w:pos="0"/>
+        </w:tabs>
+        <w:ind w:start="0" w:hanging="0"/>
+      </w:pPr>
     </w:lvl>
     <w:lvl w:ilvl="4">
       <w:start w:val="1"/>
-      <w:numFmt w:val="bullet"/>
-      <w:lvlText w:val=""/>
-      <w:lvlJc w:val="start"/>
-      <w:pPr>
-        <w:tabs>
-          <w:tab w:val="num" w:pos="3545"/>
-        </w:tabs>
-        <w:ind w:start="3545" w:hanging="283"/>
-      </w:pPr>
-      <w:rPr>
-        <w:rFonts w:ascii="Symbol" w:hAnsi="Symbol" w:cs="Symbol" w:hint="default"/>
-      </w:rPr>
+      <w:numFmt w:val="none"/>
+      <w:suff w:val="nothing"/>
+      <w:lvlText w:val=""/>
+      <w:lvlJc w:val="start"/>
+      <w:pPr>
+        <w:tabs>
+          <w:tab w:val="num" w:pos="0"/>
+        </w:tabs>
+        <w:ind w:start="0" w:hanging="0"/>
+      </w:pPr>
     </w:lvl>
     <w:lvl w:ilvl="5">
       <w:start w:val="1"/>
-      <w:numFmt w:val="bullet"/>
-      <w:lvlText w:val=""/>
-      <w:lvlJc w:val="start"/>
-      <w:pPr>
-        <w:tabs>
-          <w:tab w:val="num" w:pos="4254"/>
-        </w:tabs>
-        <w:ind w:start="4254" w:hanging="283"/>
-      </w:pPr>
-      <w:rPr>
-        <w:rFonts w:ascii="Symbol" w:hAnsi="Symbol" w:cs="Symbol" w:hint="default"/>
-      </w:rPr>
+      <w:numFmt w:val="none"/>
+      <w:suff w:val="nothing"/>
+      <w:lvlText w:val=""/>
+      <w:lvlJc w:val="start"/>
+      <w:pPr>
+        <w:tabs>
+          <w:tab w:val="num" w:pos="0"/>
+        </w:tabs>
+        <w:ind w:start="0" w:hanging="0"/>
+      </w:pPr>
     </w:lvl>
     <w:lvl w:ilvl="6">
       <w:start w:val="1"/>
-      <w:numFmt w:val="bullet"/>
-      <w:lvlText w:val=""/>
-      <w:lvlJc w:val="start"/>
-      <w:pPr>
-        <w:tabs>
-          <w:tab w:val="num" w:pos="4963"/>
-        </w:tabs>
-        <w:ind w:start="4963" w:hanging="283"/>
-      </w:pPr>
-      <w:rPr>
-        <w:rFonts w:ascii="Symbol" w:hAnsi="Symbol" w:cs="Symbol" w:hint="default"/>
-      </w:rPr>
+      <w:numFmt w:val="none"/>
+      <w:suff w:val="nothing"/>
+      <w:lvlText w:val=""/>
+      <w:lvlJc w:val="start"/>
+      <w:pPr>
+        <w:tabs>
+          <w:tab w:val="num" w:pos="0"/>
+        </w:tabs>
+        <w:ind w:start="0" w:hanging="0"/>
+      </w:pPr>
     </w:lvl>
     <w:lvl w:ilvl="7">
       <w:start w:val="1"/>
-      <w:numFmt w:val="bullet"/>
-      <w:lvlText w:val=""/>
-      <w:lvlJc w:val="start"/>
-      <w:pPr>
-        <w:tabs>
-          <w:tab w:val="num" w:pos="5672"/>
-        </w:tabs>
-        <w:ind w:start="5672" w:hanging="283"/>
-      </w:pPr>
-      <w:rPr>
-        <w:rFonts w:ascii="Symbol" w:hAnsi="Symbol" w:cs="Symbol" w:hint="default"/>
-      </w:rPr>
+      <w:numFmt w:val="none"/>
+      <w:suff w:val="nothing"/>
+      <w:lvlText w:val=""/>
+      <w:lvlJc w:val="start"/>
+      <w:pPr>
+        <w:tabs>
+          <w:tab w:val="num" w:pos="0"/>
+        </w:tabs>
+        <w:ind w:start="0" w:hanging="0"/>
+      </w:pPr>
     </w:lvl>
     <w:lvl w:ilvl="8">
       <w:start w:val="1"/>
-      <w:numFmt w:val="bullet"/>
-      <w:lvlText w:val=""/>
-      <w:lvlJc w:val="start"/>
-      <w:pPr>
-        <w:tabs>
-          <w:tab w:val="num" w:pos="6381"/>
-        </w:tabs>
-        <w:ind w:start="6381" w:hanging="283"/>
-      </w:pPr>
-      <w:rPr>
-        <w:rFonts w:ascii="Symbol" w:hAnsi="Symbol" w:cs="Symbol" w:hint="default"/>
-      </w:rPr>
+      <w:numFmt w:val="none"/>
+      <w:suff w:val="nothing"/>
+      <w:lvlText w:val=""/>
+      <w:lvlJc w:val="start"/>
+      <w:pPr>
+        <w:tabs>
+          <w:tab w:val="num" w:pos="0"/>
+        </w:tabs>
+        <w:ind w:start="0" w:hanging="0"/>
+      </w:pPr>
     </w:lvl>
   </w:abstractNum>
   <w:num w:numId="1">
@@ -1429,7 +1328,6 @@
     </w:rPrDefault>
     <w:pPrDefault>
       <w:pPr>
-        <w:widowControl/>
         <w:suppressAutoHyphens w:val="true"/>
       </w:pPr>
     </w:pPrDefault>
@@ -1439,10 +1337,11 @@
     <w:qFormat/>
     <w:pPr>
       <w:widowControl/>
-      <w:kinsoku w:val="true"/>
-      <w:overflowPunct w:val="true"/>
-      <w:autoSpaceDE w:val="true"/>
+      <w:suppressAutoHyphens w:val="true"/>
+      <w:overflowPunct w:val="false"/>
       <w:bidi w:val="0"/>
+      <w:spacing w:before="0" w:after="0"/>
+      <w:jc w:val="start"/>
     </w:pPr>
     <w:rPr>
       <w:rFonts w:ascii="Liberation Serif" w:hAnsi="Liberation Serif" w:eastAsia="Noto Serif CJK SC" w:cs="Noto Sans Devanagari"/>

</xml_diff>